<commit_message>
New irrigation preset; N/A option for Type of pain
- Irrigation preset: NaOCl 6% after each instrument with K10
  recapitulation, sonic activation (Emate Activator), EDTA 17% and a
  final 3mL of NaOCl. The NaOCl % box is gone (6% is in the text).
- Type of pain: N/A checkbox in the app and a matching box on the
  "Type of pain" line of the Word logbook. While ticked, the pain-type
  questions are hidden and left unticked in the document (answers kept).

Co-Authored-By: Claude Opus 5.5 <noreply@anthropic.com>
Claude-Session: https://claude.ai/code/session_014QzyJNshTrTEDRpXzuacGg
</commit_message>
<xml_diff>
--- a/src/template.docx
+++ b/src/template.docx
@@ -1401,6 +1401,25 @@
           <w:sz w:val="20"/>
         </w:rPr>
         <w:t>pain</w:t>
+      </w:r>
+      <w:r>
+        <w:rPr>
+          <w:sz w:val="20"/>
+        </w:rPr>
+        <w:t xml:space="preserve">  </w:t>
+      </w:r>
+      <w:r>
+        <w:rPr>
+          <w:rFonts w:ascii="MS Gothic" w:hAnsi="MS Gothic"/>
+          <w:sz w:val="20"/>
+        </w:rPr>
+        <w:t>□</w:t>
+      </w:r>
+      <w:r>
+        <w:rPr>
+          <w:sz w:val="20"/>
+        </w:rPr>
+        <w:t>N/A</w:t>
       </w:r>
     </w:p>
     <w:p>

</xml_diff>